<commit_message>
Set GEO documents in Helvetica; treat 15 € as pitch example
15 € per text is the calculation example for small and mid-sized
agencies (package pays off from the 7th text); 12 € is a single data
point from one small agency. Agencies set their own resale price.

Co-Authored-By: Claude Opus 5.5 <noreply@anthropic.com>
Claude-Session: https://claude.ai/code/session_01NMQaoUeHEbPLTJ9CdvHzwP
</commit_message>
<xml_diff>
--- a/reports/2026-10-28_GEO/Was_Leon_tun_soll.docx
+++ b/reports/2026-10-28_GEO/Was_Leon_tun_soll.docx
@@ -8,7 +8,7 @@
       </w:pPr>
       <w:r>
         <w:rPr>
-          <w:rFonts w:ascii="Avenir Next" w:cs="Avenir Next" w:eastAsia="Avenir Next" w:hAnsi="Avenir Next"/>
+          <w:rFonts w:ascii="Helvetica" w:cs="Helvetica" w:eastAsia="Helvetica" w:hAnsi="Helvetica"/>
           <w:color w:val="6B6B6B"/>
           <w:spacing w:val="30"/>
           <w:sz w:val="15"/>
@@ -23,7 +23,7 @@
       </w:pPr>
       <w:r>
         <w:rPr>
-          <w:rFonts w:ascii="Avenir Next" w:cs="Avenir Next" w:eastAsia="Avenir Next" w:hAnsi="Avenir Next"/>
+          <w:rFonts w:ascii="Helvetica" w:cs="Helvetica" w:eastAsia="Helvetica" w:hAnsi="Helvetica"/>
           <w:b/>
           <w:bCs/>
           <w:sz w:val="44"/>
@@ -38,7 +38,7 @@
       </w:pPr>
       <w:r>
         <w:rPr>
-          <w:rFonts w:ascii="Avenir Next" w:cs="Avenir Next" w:eastAsia="Avenir Next" w:hAnsi="Avenir Next"/>
+          <w:rFonts w:ascii="Helvetica" w:cs="Helvetica" w:eastAsia="Helvetica" w:hAnsi="Helvetica"/>
           <w:color w:val="555555"/>
           <w:sz w:val="22"/>
           <w:szCs w:val="22"/>
@@ -56,7 +56,7 @@
       </w:pPr>
       <w:r>
         <w:rPr>
-          <w:rFonts w:ascii="Avenir Next" w:cs="Avenir Next" w:eastAsia="Avenir Next" w:hAnsi="Avenir Next"/>
+          <w:rFonts w:ascii="Helvetica" w:cs="Helvetica" w:eastAsia="Helvetica" w:hAnsi="Helvetica"/>
           <w:color w:val="1B3AA8"/>
           <w:spacing w:val="20"/>
           <w:sz w:val="15"/>
@@ -75,7 +75,7 @@
       </w:pPr>
       <w:r>
         <w:rPr>
-          <w:rFonts w:ascii="Avenir Next" w:cs="Avenir Next" w:eastAsia="Avenir Next" w:hAnsi="Avenir Next"/>
+          <w:rFonts w:ascii="Helvetica" w:cs="Helvetica" w:eastAsia="Helvetica" w:hAnsi="Helvetica"/>
           <w:color w:val="1A1A1A"/>
           <w:sz w:val="20"/>
           <w:szCs w:val="20"/>
@@ -94,7 +94,7 @@
       </w:pPr>
       <w:r>
         <w:rPr>
-          <w:rFonts w:ascii="Georgia" w:cs="Georgia" w:eastAsia="Georgia" w:hAnsi="Georgia"/>
+          <w:rFonts w:ascii="Helvetica" w:cs="Helvetica" w:eastAsia="Helvetica" w:hAnsi="Helvetica"/>
           <w:color w:val="555555"/>
           <w:sz w:val="18"/>
           <w:szCs w:val="18"/>
@@ -117,7 +117,7 @@
       </w:pPr>
       <w:r>
         <w:rPr>
-          <w:rFonts w:ascii="Georgia" w:cs="Georgia" w:eastAsia="Georgia" w:hAnsi="Georgia"/>
+          <w:rFonts w:ascii="Helvetica" w:cs="Helvetica" w:eastAsia="Helvetica" w:hAnsi="Helvetica"/>
           <w:color w:val="1A1A1A"/>
           <w:sz w:val="20"/>
           <w:szCs w:val="20"/>
@@ -170,7 +170,7 @@
             </w:pPr>
             <w:r>
               <w:rPr>
-                <w:rFonts w:ascii="Avenir Next" w:cs="Avenir Next" w:eastAsia="Avenir Next" w:hAnsi="Avenir Next"/>
+                <w:rFonts w:ascii="Helvetica" w:cs="Helvetica" w:eastAsia="Helvetica" w:hAnsi="Helvetica"/>
                 <w:b/>
                 <w:bCs/>
                 <w:color w:val="333333"/>
@@ -203,7 +203,7 @@
             </w:pPr>
             <w:r>
               <w:rPr>
-                <w:rFonts w:ascii="Avenir Next" w:cs="Avenir Next" w:eastAsia="Avenir Next" w:hAnsi="Avenir Next"/>
+                <w:rFonts w:ascii="Helvetica" w:cs="Helvetica" w:eastAsia="Helvetica" w:hAnsi="Helvetica"/>
                 <w:b/>
                 <w:bCs/>
                 <w:color w:val="333333"/>
@@ -236,7 +236,7 @@
             </w:pPr>
             <w:r>
               <w:rPr>
-                <w:rFonts w:ascii="Avenir Next" w:cs="Avenir Next" w:eastAsia="Avenir Next" w:hAnsi="Avenir Next"/>
+                <w:rFonts w:ascii="Helvetica" w:cs="Helvetica" w:eastAsia="Helvetica" w:hAnsi="Helvetica"/>
                 <w:b/>
                 <w:bCs/>
                 <w:color w:val="333333"/>
@@ -269,7 +269,7 @@
             </w:pPr>
             <w:r>
               <w:rPr>
-                <w:rFonts w:ascii="Avenir Next" w:cs="Avenir Next" w:eastAsia="Avenir Next" w:hAnsi="Avenir Next"/>
+                <w:rFonts w:ascii="Helvetica" w:cs="Helvetica" w:eastAsia="Helvetica" w:hAnsi="Helvetica"/>
                 <w:b/>
                 <w:bCs/>
                 <w:color w:val="333333"/>
@@ -307,7 +307,7 @@
             </w:pPr>
             <w:r>
               <w:rPr>
-                <w:rFonts w:ascii="Avenir Next" w:cs="Avenir Next" w:eastAsia="Avenir Next" w:hAnsi="Avenir Next"/>
+                <w:rFonts w:ascii="Helvetica" w:cs="Helvetica" w:eastAsia="Helvetica" w:hAnsi="Helvetica"/>
                 <w:color w:val="1A1A1A"/>
                 <w:sz w:val="15"/>
                 <w:szCs w:val="15"/>
@@ -338,7 +338,7 @@
             </w:pPr>
             <w:r>
               <w:rPr>
-                <w:rFonts w:ascii="Avenir Next" w:cs="Avenir Next" w:eastAsia="Avenir Next" w:hAnsi="Avenir Next"/>
+                <w:rFonts w:ascii="Helvetica" w:cs="Helvetica" w:eastAsia="Helvetica" w:hAnsi="Helvetica"/>
                 <w:color w:val="1A1A1A"/>
                 <w:sz w:val="15"/>
                 <w:szCs w:val="15"/>
@@ -369,7 +369,7 @@
             </w:pPr>
             <w:r>
               <w:rPr>
-                <w:rFonts w:ascii="Avenir Next" w:cs="Avenir Next" w:eastAsia="Avenir Next" w:hAnsi="Avenir Next"/>
+                <w:rFonts w:ascii="Helvetica" w:cs="Helvetica" w:eastAsia="Helvetica" w:hAnsi="Helvetica"/>
                 <w:color w:val="1A1A1A"/>
                 <w:sz w:val="15"/>
                 <w:szCs w:val="15"/>
@@ -400,7 +400,7 @@
             </w:pPr>
             <w:r>
               <w:rPr>
-                <w:rFonts w:ascii="Avenir Next" w:cs="Avenir Next" w:eastAsia="Avenir Next" w:hAnsi="Avenir Next"/>
+                <w:rFonts w:ascii="Helvetica" w:cs="Helvetica" w:eastAsia="Helvetica" w:hAnsi="Helvetica"/>
                 <w:color w:val="1A1A1A"/>
                 <w:sz w:val="15"/>
                 <w:szCs w:val="15"/>
@@ -436,7 +436,7 @@
             </w:pPr>
             <w:r>
               <w:rPr>
-                <w:rFonts w:ascii="Avenir Next" w:cs="Avenir Next" w:eastAsia="Avenir Next" w:hAnsi="Avenir Next"/>
+                <w:rFonts w:ascii="Helvetica" w:cs="Helvetica" w:eastAsia="Helvetica" w:hAnsi="Helvetica"/>
                 <w:color w:val="1A1A1A"/>
                 <w:sz w:val="15"/>
                 <w:szCs w:val="15"/>
@@ -467,7 +467,7 @@
             </w:pPr>
             <w:r>
               <w:rPr>
-                <w:rFonts w:ascii="Avenir Next" w:cs="Avenir Next" w:eastAsia="Avenir Next" w:hAnsi="Avenir Next"/>
+                <w:rFonts w:ascii="Helvetica" w:cs="Helvetica" w:eastAsia="Helvetica" w:hAnsi="Helvetica"/>
                 <w:color w:val="1A1A1A"/>
                 <w:sz w:val="15"/>
                 <w:szCs w:val="15"/>
@@ -498,7 +498,7 @@
             </w:pPr>
             <w:r>
               <w:rPr>
-                <w:rFonts w:ascii="Avenir Next" w:cs="Avenir Next" w:eastAsia="Avenir Next" w:hAnsi="Avenir Next"/>
+                <w:rFonts w:ascii="Helvetica" w:cs="Helvetica" w:eastAsia="Helvetica" w:hAnsi="Helvetica"/>
                 <w:color w:val="1A1A1A"/>
                 <w:sz w:val="15"/>
                 <w:szCs w:val="15"/>
@@ -529,7 +529,7 @@
             </w:pPr>
             <w:r>
               <w:rPr>
-                <w:rFonts w:ascii="Avenir Next" w:cs="Avenir Next" w:eastAsia="Avenir Next" w:hAnsi="Avenir Next"/>
+                <w:rFonts w:ascii="Helvetica" w:cs="Helvetica" w:eastAsia="Helvetica" w:hAnsi="Helvetica"/>
                 <w:color w:val="1A1A1A"/>
                 <w:sz w:val="15"/>
                 <w:szCs w:val="15"/>
@@ -565,7 +565,7 @@
             </w:pPr>
             <w:r>
               <w:rPr>
-                <w:rFonts w:ascii="Avenir Next" w:cs="Avenir Next" w:eastAsia="Avenir Next" w:hAnsi="Avenir Next"/>
+                <w:rFonts w:ascii="Helvetica" w:cs="Helvetica" w:eastAsia="Helvetica" w:hAnsi="Helvetica"/>
                 <w:color w:val="1A1A1A"/>
                 <w:sz w:val="15"/>
                 <w:szCs w:val="15"/>
@@ -596,7 +596,7 @@
             </w:pPr>
             <w:r>
               <w:rPr>
-                <w:rFonts w:ascii="Avenir Next" w:cs="Avenir Next" w:eastAsia="Avenir Next" w:hAnsi="Avenir Next"/>
+                <w:rFonts w:ascii="Helvetica" w:cs="Helvetica" w:eastAsia="Helvetica" w:hAnsi="Helvetica"/>
                 <w:color w:val="1A1A1A"/>
                 <w:sz w:val="15"/>
                 <w:szCs w:val="15"/>
@@ -627,7 +627,7 @@
             </w:pPr>
             <w:r>
               <w:rPr>
-                <w:rFonts w:ascii="Avenir Next" w:cs="Avenir Next" w:eastAsia="Avenir Next" w:hAnsi="Avenir Next"/>
+                <w:rFonts w:ascii="Helvetica" w:cs="Helvetica" w:eastAsia="Helvetica" w:hAnsi="Helvetica"/>
                 <w:color w:val="1A1A1A"/>
                 <w:sz w:val="15"/>
                 <w:szCs w:val="15"/>
@@ -658,7 +658,7 @@
             </w:pPr>
             <w:r>
               <w:rPr>
-                <w:rFonts w:ascii="Avenir Next" w:cs="Avenir Next" w:eastAsia="Avenir Next" w:hAnsi="Avenir Next"/>
+                <w:rFonts w:ascii="Helvetica" w:cs="Helvetica" w:eastAsia="Helvetica" w:hAnsi="Helvetica"/>
                 <w:color w:val="1A1A1A"/>
                 <w:sz w:val="15"/>
                 <w:szCs w:val="15"/>
@@ -694,7 +694,7 @@
             </w:pPr>
             <w:r>
               <w:rPr>
-                <w:rFonts w:ascii="Avenir Next" w:cs="Avenir Next" w:eastAsia="Avenir Next" w:hAnsi="Avenir Next"/>
+                <w:rFonts w:ascii="Helvetica" w:cs="Helvetica" w:eastAsia="Helvetica" w:hAnsi="Helvetica"/>
                 <w:color w:val="1A1A1A"/>
                 <w:sz w:val="15"/>
                 <w:szCs w:val="15"/>
@@ -725,7 +725,7 @@
             </w:pPr>
             <w:r>
               <w:rPr>
-                <w:rFonts w:ascii="Avenir Next" w:cs="Avenir Next" w:eastAsia="Avenir Next" w:hAnsi="Avenir Next"/>
+                <w:rFonts w:ascii="Helvetica" w:cs="Helvetica" w:eastAsia="Helvetica" w:hAnsi="Helvetica"/>
                 <w:color w:val="1A1A1A"/>
                 <w:sz w:val="15"/>
                 <w:szCs w:val="15"/>
@@ -756,7 +756,7 @@
             </w:pPr>
             <w:r>
               <w:rPr>
-                <w:rFonts w:ascii="Avenir Next" w:cs="Avenir Next" w:eastAsia="Avenir Next" w:hAnsi="Avenir Next"/>
+                <w:rFonts w:ascii="Helvetica" w:cs="Helvetica" w:eastAsia="Helvetica" w:hAnsi="Helvetica"/>
                 <w:color w:val="1A1A1A"/>
                 <w:sz w:val="15"/>
                 <w:szCs w:val="15"/>
@@ -787,7 +787,7 @@
             </w:pPr>
             <w:r>
               <w:rPr>
-                <w:rFonts w:ascii="Avenir Next" w:cs="Avenir Next" w:eastAsia="Avenir Next" w:hAnsi="Avenir Next"/>
+                <w:rFonts w:ascii="Helvetica" w:cs="Helvetica" w:eastAsia="Helvetica" w:hAnsi="Helvetica"/>
                 <w:color w:val="1A1A1A"/>
                 <w:sz w:val="15"/>
                 <w:szCs w:val="15"/>
@@ -819,7 +819,7 @@
       </w:pPr>
       <w:r>
         <w:rPr>
-          <w:rFonts w:ascii="Avenir Next" w:cs="Avenir Next" w:eastAsia="Avenir Next" w:hAnsi="Avenir Next"/>
+          <w:rFonts w:ascii="Helvetica" w:cs="Helvetica" w:eastAsia="Helvetica" w:hAnsi="Helvetica"/>
           <w:b/>
           <w:bCs/>
           <w:color w:val="1A1A1A"/>
@@ -836,7 +836,7 @@
       </w:pPr>
       <w:r>
         <w:rPr>
-          <w:rFonts w:ascii="Georgia" w:cs="Georgia" w:eastAsia="Georgia" w:hAnsi="Georgia"/>
+          <w:rFonts w:ascii="Helvetica" w:cs="Helvetica" w:eastAsia="Helvetica" w:hAnsi="Helvetica"/>
           <w:color w:val="1A1A1A"/>
           <w:sz w:val="20"/>
           <w:szCs w:val="20"/>
@@ -940,7 +940,7 @@
       </w:pPr>
       <w:r>
         <w:rPr>
-          <w:rFonts w:ascii="Georgia" w:cs="Georgia" w:eastAsia="Georgia" w:hAnsi="Georgia"/>
+          <w:rFonts w:ascii="Helvetica" w:cs="Helvetica" w:eastAsia="Helvetica" w:hAnsi="Helvetica"/>
           <w:b/>
           <w:bCs/>
           <w:color w:val="1A1A1A"/>
@@ -951,7 +951,7 @@
       </w:r>
       <w:r>
         <w:rPr>
-          <w:rFonts w:ascii="Georgia" w:cs="Georgia" w:eastAsia="Georgia" w:hAnsi="Georgia"/>
+          <w:rFonts w:ascii="Helvetica" w:cs="Helvetica" w:eastAsia="Helvetica" w:hAnsi="Helvetica"/>
           <w:color w:val="1A1A1A"/>
           <w:sz w:val="20"/>
           <w:szCs w:val="20"/>
@@ -968,7 +968,7 @@
       </w:pPr>
       <w:r>
         <w:rPr>
-          <w:rFonts w:ascii="Georgia" w:cs="Georgia" w:eastAsia="Georgia" w:hAnsi="Georgia"/>
+          <w:rFonts w:ascii="Helvetica" w:cs="Helvetica" w:eastAsia="Helvetica" w:hAnsi="Helvetica"/>
           <w:b/>
           <w:bCs/>
           <w:color w:val="444444"/>
@@ -979,7 +979,7 @@
       </w:r>
       <w:r>
         <w:rPr>
-          <w:rFonts w:ascii="Georgia" w:cs="Georgia" w:eastAsia="Georgia" w:hAnsi="Georgia"/>
+          <w:rFonts w:ascii="Helvetica" w:cs="Helvetica" w:eastAsia="Helvetica" w:hAnsi="Helvetica"/>
           <w:color w:val="444444"/>
           <w:sz w:val="20"/>
           <w:szCs w:val="20"/>
@@ -994,7 +994,7 @@
       </w:pPr>
       <w:r>
         <w:rPr>
-          <w:rFonts w:ascii="Avenir Next" w:cs="Avenir Next" w:eastAsia="Avenir Next" w:hAnsi="Avenir Next"/>
+          <w:rFonts w:ascii="Helvetica" w:cs="Helvetica" w:eastAsia="Helvetica" w:hAnsi="Helvetica"/>
           <w:b/>
           <w:bCs/>
           <w:color w:val="1A1A1A"/>
@@ -1011,7 +1011,7 @@
       </w:pPr>
       <w:r>
         <w:rPr>
-          <w:rFonts w:ascii="Georgia" w:cs="Georgia" w:eastAsia="Georgia" w:hAnsi="Georgia"/>
+          <w:rFonts w:ascii="Helvetica" w:cs="Helvetica" w:eastAsia="Helvetica" w:hAnsi="Helvetica"/>
           <w:color w:val="1A1A1A"/>
           <w:sz w:val="20"/>
           <w:szCs w:val="20"/>
@@ -1029,7 +1029,7 @@
       </w:r>
       <w:r>
         <w:rPr>
-          <w:rFonts w:ascii="Georgia" w:cs="Georgia" w:eastAsia="Georgia" w:hAnsi="Georgia"/>
+          <w:rFonts w:ascii="Helvetica" w:cs="Helvetica" w:eastAsia="Helvetica" w:hAnsi="Helvetica"/>
           <w:color w:val="1A1A1A"/>
           <w:sz w:val="20"/>
           <w:szCs w:val="20"/>
@@ -1061,7 +1061,7 @@
       </w:pPr>
       <w:r>
         <w:rPr>
-          <w:rFonts w:ascii="Georgia" w:cs="Georgia" w:eastAsia="Georgia" w:hAnsi="Georgia"/>
+          <w:rFonts w:ascii="Helvetica" w:cs="Helvetica" w:eastAsia="Helvetica" w:hAnsi="Helvetica"/>
           <w:b/>
           <w:bCs/>
           <w:color w:val="1A1A1A"/>
@@ -1072,7 +1072,7 @@
       </w:r>
       <w:r>
         <w:rPr>
-          <w:rFonts w:ascii="Georgia" w:cs="Georgia" w:eastAsia="Georgia" w:hAnsi="Georgia"/>
+          <w:rFonts w:ascii="Helvetica" w:cs="Helvetica" w:eastAsia="Helvetica" w:hAnsi="Helvetica"/>
           <w:color w:val="1A1A1A"/>
           <w:sz w:val="20"/>
           <w:szCs w:val="20"/>
@@ -1089,7 +1089,7 @@
       </w:pPr>
       <w:r>
         <w:rPr>
-          <w:rFonts w:ascii="Georgia" w:cs="Georgia" w:eastAsia="Georgia" w:hAnsi="Georgia"/>
+          <w:rFonts w:ascii="Helvetica" w:cs="Helvetica" w:eastAsia="Helvetica" w:hAnsi="Helvetica"/>
           <w:b/>
           <w:bCs/>
           <w:color w:val="444444"/>
@@ -1100,7 +1100,7 @@
       </w:r>
       <w:r>
         <w:rPr>
-          <w:rFonts w:ascii="Georgia" w:cs="Georgia" w:eastAsia="Georgia" w:hAnsi="Georgia"/>
+          <w:rFonts w:ascii="Helvetica" w:cs="Helvetica" w:eastAsia="Helvetica" w:hAnsi="Helvetica"/>
           <w:color w:val="444444"/>
           <w:sz w:val="20"/>
           <w:szCs w:val="20"/>
@@ -1115,7 +1115,7 @@
       </w:pPr>
       <w:r>
         <w:rPr>
-          <w:rFonts w:ascii="Avenir Next" w:cs="Avenir Next" w:eastAsia="Avenir Next" w:hAnsi="Avenir Next"/>
+          <w:rFonts w:ascii="Helvetica" w:cs="Helvetica" w:eastAsia="Helvetica" w:hAnsi="Helvetica"/>
           <w:b/>
           <w:bCs/>
           <w:color w:val="1A1A1A"/>
@@ -1132,7 +1132,7 @@
       </w:pPr>
       <w:r>
         <w:rPr>
-          <w:rFonts w:ascii="Georgia" w:cs="Georgia" w:eastAsia="Georgia" w:hAnsi="Georgia"/>
+          <w:rFonts w:ascii="Helvetica" w:cs="Helvetica" w:eastAsia="Helvetica" w:hAnsi="Helvetica"/>
           <w:b/>
           <w:bCs/>
           <w:color w:val="1A1A1A"/>
@@ -1143,7 +1143,7 @@
       </w:r>
       <w:r>
         <w:rPr>
-          <w:rFonts w:ascii="Georgia" w:cs="Georgia" w:eastAsia="Georgia" w:hAnsi="Georgia"/>
+          <w:rFonts w:ascii="Helvetica" w:cs="Helvetica" w:eastAsia="Helvetica" w:hAnsi="Helvetica"/>
           <w:color w:val="1A1A1A"/>
           <w:sz w:val="20"/>
           <w:szCs w:val="20"/>
@@ -1158,7 +1158,7 @@
       </w:pPr>
       <w:r>
         <w:rPr>
-          <w:rFonts w:ascii="Georgia" w:cs="Georgia" w:eastAsia="Georgia" w:hAnsi="Georgia"/>
+          <w:rFonts w:ascii="Helvetica" w:cs="Helvetica" w:eastAsia="Helvetica" w:hAnsi="Helvetica"/>
           <w:b/>
           <w:bCs/>
           <w:color w:val="1A1A1A"/>
@@ -1169,7 +1169,7 @@
       </w:r>
       <w:r>
         <w:rPr>
-          <w:rFonts w:ascii="Georgia" w:cs="Georgia" w:eastAsia="Georgia" w:hAnsi="Georgia"/>
+          <w:rFonts w:ascii="Helvetica" w:cs="Helvetica" w:eastAsia="Helvetica" w:hAnsi="Helvetica"/>
           <w:color w:val="1A1A1A"/>
           <w:sz w:val="20"/>
           <w:szCs w:val="20"/>
@@ -1184,7 +1184,7 @@
       </w:pPr>
       <w:r>
         <w:rPr>
-          <w:rFonts w:ascii="Georgia" w:cs="Georgia" w:eastAsia="Georgia" w:hAnsi="Georgia"/>
+          <w:rFonts w:ascii="Helvetica" w:cs="Helvetica" w:eastAsia="Helvetica" w:hAnsi="Helvetica"/>
           <w:b/>
           <w:bCs/>
           <w:color w:val="1A1A1A"/>
@@ -1195,7 +1195,7 @@
       </w:r>
       <w:r>
         <w:rPr>
-          <w:rFonts w:ascii="Georgia" w:cs="Georgia" w:eastAsia="Georgia" w:hAnsi="Georgia"/>
+          <w:rFonts w:ascii="Helvetica" w:cs="Helvetica" w:eastAsia="Helvetica" w:hAnsi="Helvetica"/>
           <w:color w:val="1A1A1A"/>
           <w:sz w:val="20"/>
           <w:szCs w:val="20"/>
@@ -1210,7 +1210,7 @@
       </w:pPr>
       <w:r>
         <w:rPr>
-          <w:rFonts w:ascii="Georgia" w:cs="Georgia" w:eastAsia="Georgia" w:hAnsi="Georgia"/>
+          <w:rFonts w:ascii="Helvetica" w:cs="Helvetica" w:eastAsia="Helvetica" w:hAnsi="Helvetica"/>
           <w:color w:val="1A1A1A"/>
           <w:sz w:val="20"/>
           <w:szCs w:val="20"/>
@@ -1224,7 +1224,7 @@
       </w:pPr>
       <w:r>
         <w:rPr>
-          <w:rFonts w:ascii="Georgia" w:cs="Georgia" w:eastAsia="Georgia" w:hAnsi="Georgia"/>
+          <w:rFonts w:ascii="Helvetica" w:cs="Helvetica" w:eastAsia="Helvetica" w:hAnsi="Helvetica"/>
           <w:b/>
           <w:bCs/>
           <w:color w:val="1A1A1A"/>
@@ -1235,7 +1235,7 @@
       </w:r>
       <w:r>
         <w:rPr>
-          <w:rFonts w:ascii="Georgia" w:cs="Georgia" w:eastAsia="Georgia" w:hAnsi="Georgia"/>
+          <w:rFonts w:ascii="Helvetica" w:cs="Helvetica" w:eastAsia="Helvetica" w:hAnsi="Helvetica"/>
           <w:color w:val="1A1A1A"/>
           <w:sz w:val="20"/>
           <w:szCs w:val="20"/>
@@ -1252,7 +1252,7 @@
       </w:pPr>
       <w:r>
         <w:rPr>
-          <w:rFonts w:ascii="Georgia" w:cs="Georgia" w:eastAsia="Georgia" w:hAnsi="Georgia"/>
+          <w:rFonts w:ascii="Helvetica" w:cs="Helvetica" w:eastAsia="Helvetica" w:hAnsi="Helvetica"/>
           <w:b/>
           <w:bCs/>
           <w:color w:val="444444"/>
@@ -1263,7 +1263,7 @@
       </w:r>
       <w:r>
         <w:rPr>
-          <w:rFonts w:ascii="Georgia" w:cs="Georgia" w:eastAsia="Georgia" w:hAnsi="Georgia"/>
+          <w:rFonts w:ascii="Helvetica" w:cs="Helvetica" w:eastAsia="Helvetica" w:hAnsi="Helvetica"/>
           <w:color w:val="444444"/>
           <w:sz w:val="20"/>
           <w:szCs w:val="20"/>
@@ -1278,7 +1278,7 @@
       </w:pPr>
       <w:r>
         <w:rPr>
-          <w:rFonts w:ascii="Avenir Next" w:cs="Avenir Next" w:eastAsia="Avenir Next" w:hAnsi="Avenir Next"/>
+          <w:rFonts w:ascii="Helvetica" w:cs="Helvetica" w:eastAsia="Helvetica" w:hAnsi="Helvetica"/>
           <w:b/>
           <w:bCs/>
           <w:color w:val="1A1A1A"/>
@@ -1295,7 +1295,7 @@
       </w:pPr>
       <w:r>
         <w:rPr>
-          <w:rFonts w:ascii="Georgia" w:cs="Georgia" w:eastAsia="Georgia" w:hAnsi="Georgia"/>
+          <w:rFonts w:ascii="Helvetica" w:cs="Helvetica" w:eastAsia="Helvetica" w:hAnsi="Helvetica"/>
           <w:color w:val="1A1A1A"/>
           <w:sz w:val="20"/>
           <w:szCs w:val="20"/>
@@ -1309,7 +1309,7 @@
       </w:pPr>
       <w:r>
         <w:rPr>
-          <w:rFonts w:ascii="Georgia" w:cs="Georgia" w:eastAsia="Georgia" w:hAnsi="Georgia"/>
+          <w:rFonts w:ascii="Helvetica" w:cs="Helvetica" w:eastAsia="Helvetica" w:hAnsi="Helvetica"/>
           <w:b/>
           <w:bCs/>
           <w:color w:val="1A1A1A"/>
@@ -1320,7 +1320,7 @@
       </w:r>
       <w:r>
         <w:rPr>
-          <w:rFonts w:ascii="Georgia" w:cs="Georgia" w:eastAsia="Georgia" w:hAnsi="Georgia"/>
+          <w:rFonts w:ascii="Helvetica" w:cs="Helvetica" w:eastAsia="Helvetica" w:hAnsi="Helvetica"/>
           <w:color w:val="1A1A1A"/>
           <w:sz w:val="20"/>
           <w:szCs w:val="20"/>
@@ -1337,7 +1337,7 @@
       </w:pPr>
       <w:r>
         <w:rPr>
-          <w:rFonts w:ascii="Georgia" w:cs="Georgia" w:eastAsia="Georgia" w:hAnsi="Georgia"/>
+          <w:rFonts w:ascii="Helvetica" w:cs="Helvetica" w:eastAsia="Helvetica" w:hAnsi="Helvetica"/>
           <w:b/>
           <w:bCs/>
           <w:color w:val="444444"/>
@@ -1348,7 +1348,7 @@
       </w:r>
       <w:r>
         <w:rPr>
-          <w:rFonts w:ascii="Georgia" w:cs="Georgia" w:eastAsia="Georgia" w:hAnsi="Georgia"/>
+          <w:rFonts w:ascii="Helvetica" w:cs="Helvetica" w:eastAsia="Helvetica" w:hAnsi="Helvetica"/>
           <w:color w:val="444444"/>
           <w:sz w:val="20"/>
           <w:szCs w:val="20"/>
@@ -1363,7 +1363,7 @@
       </w:pPr>
       <w:r>
         <w:rPr>
-          <w:rFonts w:ascii="Avenir Next" w:cs="Avenir Next" w:eastAsia="Avenir Next" w:hAnsi="Avenir Next"/>
+          <w:rFonts w:ascii="Helvetica" w:cs="Helvetica" w:eastAsia="Helvetica" w:hAnsi="Helvetica"/>
           <w:b/>
           <w:bCs/>
           <w:color w:val="1A1A1A"/>
@@ -1380,7 +1380,7 @@
       </w:pPr>
       <w:r>
         <w:rPr>
-          <w:rFonts w:ascii="Georgia" w:cs="Georgia" w:eastAsia="Georgia" w:hAnsi="Georgia"/>
+          <w:rFonts w:ascii="Helvetica" w:cs="Helvetica" w:eastAsia="Helvetica" w:hAnsi="Helvetica"/>
           <w:color w:val="1A1A1A"/>
           <w:sz w:val="20"/>
           <w:szCs w:val="20"/>
@@ -1395,7 +1395,7 @@
       </w:pPr>
       <w:r>
         <w:rPr>
-          <w:rFonts w:ascii="Georgia" w:cs="Georgia" w:eastAsia="Georgia" w:hAnsi="Georgia"/>
+          <w:rFonts w:ascii="Helvetica" w:cs="Helvetica" w:eastAsia="Helvetica" w:hAnsi="Helvetica"/>
           <w:color w:val="1A1A1A"/>
           <w:sz w:val="20"/>
           <w:szCs w:val="20"/>
@@ -1409,7 +1409,7 @@
       </w:pPr>
       <w:r>
         <w:rPr>
-          <w:rFonts w:ascii="Georgia" w:cs="Georgia" w:eastAsia="Georgia" w:hAnsi="Georgia"/>
+          <w:rFonts w:ascii="Helvetica" w:cs="Helvetica" w:eastAsia="Helvetica" w:hAnsi="Helvetica"/>
           <w:b/>
           <w:bCs/>
           <w:color w:val="1A1A1A"/>
@@ -1420,7 +1420,7 @@
       </w:r>
       <w:r>
         <w:rPr>
-          <w:rFonts w:ascii="Georgia" w:cs="Georgia" w:eastAsia="Georgia" w:hAnsi="Georgia"/>
+          <w:rFonts w:ascii="Helvetica" w:cs="Helvetica" w:eastAsia="Helvetica" w:hAnsi="Helvetica"/>
           <w:color w:val="1A1A1A"/>
           <w:sz w:val="20"/>
           <w:szCs w:val="20"/>
@@ -1437,7 +1437,7 @@
       </w:pPr>
       <w:r>
         <w:rPr>
-          <w:rFonts w:ascii="Georgia" w:cs="Georgia" w:eastAsia="Georgia" w:hAnsi="Georgia"/>
+          <w:rFonts w:ascii="Helvetica" w:cs="Helvetica" w:eastAsia="Helvetica" w:hAnsi="Helvetica"/>
           <w:b/>
           <w:bCs/>
           <w:color w:val="444444"/>
@@ -1448,7 +1448,7 @@
       </w:r>
       <w:r>
         <w:rPr>
-          <w:rFonts w:ascii="Georgia" w:cs="Georgia" w:eastAsia="Georgia" w:hAnsi="Georgia"/>
+          <w:rFonts w:ascii="Helvetica" w:cs="Helvetica" w:eastAsia="Helvetica" w:hAnsi="Helvetica"/>
           <w:color w:val="444444"/>
           <w:sz w:val="20"/>
           <w:szCs w:val="20"/>
@@ -1463,7 +1463,7 @@
       </w:pPr>
       <w:r>
         <w:rPr>
-          <w:rFonts w:ascii="Avenir Next" w:cs="Avenir Next" w:eastAsia="Avenir Next" w:hAnsi="Avenir Next"/>
+          <w:rFonts w:ascii="Helvetica" w:cs="Helvetica" w:eastAsia="Helvetica" w:hAnsi="Helvetica"/>
           <w:b/>
           <w:bCs/>
           <w:color w:val="1A1A1A"/>
@@ -1480,7 +1480,7 @@
       </w:pPr>
       <w:r>
         <w:rPr>
-          <w:rFonts w:ascii="Georgia" w:cs="Georgia" w:eastAsia="Georgia" w:hAnsi="Georgia"/>
+          <w:rFonts w:ascii="Helvetica" w:cs="Helvetica" w:eastAsia="Helvetica" w:hAnsi="Helvetica"/>
           <w:color w:val="1A1A1A"/>
           <w:sz w:val="20"/>
           <w:szCs w:val="20"/>
@@ -1498,7 +1498,7 @@
       </w:r>
       <w:r>
         <w:rPr>
-          <w:rFonts w:ascii="Georgia" w:cs="Georgia" w:eastAsia="Georgia" w:hAnsi="Georgia"/>
+          <w:rFonts w:ascii="Helvetica" w:cs="Helvetica" w:eastAsia="Helvetica" w:hAnsi="Helvetica"/>
           <w:color w:val="1A1A1A"/>
           <w:sz w:val="20"/>
           <w:szCs w:val="20"/>
@@ -1512,7 +1512,7 @@
       </w:pPr>
       <w:r>
         <w:rPr>
-          <w:rFonts w:ascii="Georgia" w:cs="Georgia" w:eastAsia="Georgia" w:hAnsi="Georgia"/>
+          <w:rFonts w:ascii="Helvetica" w:cs="Helvetica" w:eastAsia="Helvetica" w:hAnsi="Helvetica"/>
           <w:b/>
           <w:bCs/>
           <w:color w:val="1A1A1A"/>
@@ -1523,7 +1523,7 @@
       </w:r>
       <w:r>
         <w:rPr>
-          <w:rFonts w:ascii="Georgia" w:cs="Georgia" w:eastAsia="Georgia" w:hAnsi="Georgia"/>
+          <w:rFonts w:ascii="Helvetica" w:cs="Helvetica" w:eastAsia="Helvetica" w:hAnsi="Helvetica"/>
           <w:color w:val="1A1A1A"/>
           <w:sz w:val="20"/>
           <w:szCs w:val="20"/>
@@ -1540,7 +1540,7 @@
       </w:pPr>
       <w:r>
         <w:rPr>
-          <w:rFonts w:ascii="Georgia" w:cs="Georgia" w:eastAsia="Georgia" w:hAnsi="Georgia"/>
+          <w:rFonts w:ascii="Helvetica" w:cs="Helvetica" w:eastAsia="Helvetica" w:hAnsi="Helvetica"/>
           <w:b/>
           <w:bCs/>
           <w:color w:val="444444"/>
@@ -1551,7 +1551,7 @@
       </w:r>
       <w:r>
         <w:rPr>
-          <w:rFonts w:ascii="Georgia" w:cs="Georgia" w:eastAsia="Georgia" w:hAnsi="Georgia"/>
+          <w:rFonts w:ascii="Helvetica" w:cs="Helvetica" w:eastAsia="Helvetica" w:hAnsi="Helvetica"/>
           <w:color w:val="444444"/>
           <w:sz w:val="20"/>
           <w:szCs w:val="20"/>
@@ -1566,7 +1566,7 @@
       </w:pPr>
       <w:r>
         <w:rPr>
-          <w:rFonts w:ascii="Avenir Next" w:cs="Avenir Next" w:eastAsia="Avenir Next" w:hAnsi="Avenir Next"/>
+          <w:rFonts w:ascii="Helvetica" w:cs="Helvetica" w:eastAsia="Helvetica" w:hAnsi="Helvetica"/>
           <w:b/>
           <w:bCs/>
           <w:color w:val="1A1A1A"/>
@@ -1583,7 +1583,7 @@
       </w:pPr>
       <w:r>
         <w:rPr>
-          <w:rFonts w:ascii="Georgia" w:cs="Georgia" w:eastAsia="Georgia" w:hAnsi="Georgia"/>
+          <w:rFonts w:ascii="Helvetica" w:cs="Helvetica" w:eastAsia="Helvetica" w:hAnsi="Helvetica"/>
           <w:color w:val="1A1A1A"/>
           <w:sz w:val="20"/>
           <w:szCs w:val="20"/>
@@ -1598,7 +1598,7 @@
       </w:pPr>
       <w:r>
         <w:rPr>
-          <w:rFonts w:ascii="Georgia" w:cs="Georgia" w:eastAsia="Georgia" w:hAnsi="Georgia"/>
+          <w:rFonts w:ascii="Helvetica" w:cs="Helvetica" w:eastAsia="Helvetica" w:hAnsi="Helvetica"/>
           <w:color w:val="1A1A1A"/>
           <w:sz w:val="20"/>
           <w:szCs w:val="20"/>
@@ -1612,7 +1612,7 @@
       </w:pPr>
       <w:r>
         <w:rPr>
-          <w:rFonts w:ascii="Georgia" w:cs="Georgia" w:eastAsia="Georgia" w:hAnsi="Georgia"/>
+          <w:rFonts w:ascii="Helvetica" w:cs="Helvetica" w:eastAsia="Helvetica" w:hAnsi="Helvetica"/>
           <w:b/>
           <w:bCs/>
           <w:color w:val="1A1A1A"/>
@@ -1623,7 +1623,7 @@
       </w:r>
       <w:r>
         <w:rPr>
-          <w:rFonts w:ascii="Georgia" w:cs="Georgia" w:eastAsia="Georgia" w:hAnsi="Georgia"/>
+          <w:rFonts w:ascii="Helvetica" w:cs="Helvetica" w:eastAsia="Helvetica" w:hAnsi="Helvetica"/>
           <w:color w:val="1A1A1A"/>
           <w:sz w:val="20"/>
           <w:szCs w:val="20"/>
@@ -1640,7 +1640,7 @@
       </w:pPr>
       <w:r>
         <w:rPr>
-          <w:rFonts w:ascii="Georgia" w:cs="Georgia" w:eastAsia="Georgia" w:hAnsi="Georgia"/>
+          <w:rFonts w:ascii="Helvetica" w:cs="Helvetica" w:eastAsia="Helvetica" w:hAnsi="Helvetica"/>
           <w:b/>
           <w:bCs/>
           <w:color w:val="444444"/>
@@ -1651,7 +1651,7 @@
       </w:r>
       <w:r>
         <w:rPr>
-          <w:rFonts w:ascii="Georgia" w:cs="Georgia" w:eastAsia="Georgia" w:hAnsi="Georgia"/>
+          <w:rFonts w:ascii="Helvetica" w:cs="Helvetica" w:eastAsia="Helvetica" w:hAnsi="Helvetica"/>
           <w:color w:val="444444"/>
           <w:sz w:val="20"/>
           <w:szCs w:val="20"/>
@@ -1675,7 +1675,7 @@
       </w:pPr>
       <w:r>
         <w:rPr>
-          <w:rFonts w:ascii="Avenir Next" w:cs="Avenir Next" w:eastAsia="Avenir Next" w:hAnsi="Avenir Next"/>
+          <w:rFonts w:ascii="Helvetica" w:cs="Helvetica" w:eastAsia="Helvetica" w:hAnsi="Helvetica"/>
           <w:b/>
           <w:bCs/>
           <w:color w:val="1A1A1A"/>
@@ -1692,7 +1692,7 @@
       </w:pPr>
       <w:r>
         <w:rPr>
-          <w:rFonts w:ascii="Georgia" w:cs="Georgia" w:eastAsia="Georgia" w:hAnsi="Georgia"/>
+          <w:rFonts w:ascii="Helvetica" w:cs="Helvetica" w:eastAsia="Helvetica" w:hAnsi="Helvetica"/>
           <w:color w:val="1A1A1A"/>
           <w:sz w:val="20"/>
           <w:szCs w:val="20"/>
@@ -1710,7 +1710,7 @@
       </w:r>
       <w:r>
         <w:rPr>
-          <w:rFonts w:ascii="Georgia" w:cs="Georgia" w:eastAsia="Georgia" w:hAnsi="Georgia"/>
+          <w:rFonts w:ascii="Helvetica" w:cs="Helvetica" w:eastAsia="Helvetica" w:hAnsi="Helvetica"/>
           <w:color w:val="1A1A1A"/>
           <w:sz w:val="20"/>
           <w:szCs w:val="20"/>
@@ -2084,7 +2084,7 @@
       </w:pPr>
       <w:r>
         <w:rPr>
-          <w:rFonts w:ascii="Georgia" w:cs="Georgia" w:eastAsia="Georgia" w:hAnsi="Georgia"/>
+          <w:rFonts w:ascii="Helvetica" w:cs="Helvetica" w:eastAsia="Helvetica" w:hAnsi="Helvetica"/>
           <w:b/>
           <w:bCs/>
           <w:color w:val="1A1A1A"/>
@@ -2095,7 +2095,7 @@
       </w:r>
       <w:r>
         <w:rPr>
-          <w:rFonts w:ascii="Georgia" w:cs="Georgia" w:eastAsia="Georgia" w:hAnsi="Georgia"/>
+          <w:rFonts w:ascii="Helvetica" w:cs="Helvetica" w:eastAsia="Helvetica" w:hAnsi="Helvetica"/>
           <w:color w:val="1A1A1A"/>
           <w:sz w:val="20"/>
           <w:szCs w:val="20"/>
@@ -2112,7 +2112,7 @@
       </w:pPr>
       <w:r>
         <w:rPr>
-          <w:rFonts w:ascii="Georgia" w:cs="Georgia" w:eastAsia="Georgia" w:hAnsi="Georgia"/>
+          <w:rFonts w:ascii="Helvetica" w:cs="Helvetica" w:eastAsia="Helvetica" w:hAnsi="Helvetica"/>
           <w:b/>
           <w:bCs/>
           <w:color w:val="444444"/>
@@ -2123,7 +2123,7 @@
       </w:r>
       <w:r>
         <w:rPr>
-          <w:rFonts w:ascii="Georgia" w:cs="Georgia" w:eastAsia="Georgia" w:hAnsi="Georgia"/>
+          <w:rFonts w:ascii="Helvetica" w:cs="Helvetica" w:eastAsia="Helvetica" w:hAnsi="Helvetica"/>
           <w:color w:val="444444"/>
           <w:sz w:val="20"/>
           <w:szCs w:val="20"/>
@@ -2138,7 +2138,7 @@
       </w:pPr>
       <w:r>
         <w:rPr>
-          <w:rFonts w:ascii="Avenir Next" w:cs="Avenir Next" w:eastAsia="Avenir Next" w:hAnsi="Avenir Next"/>
+          <w:rFonts w:ascii="Helvetica" w:cs="Helvetica" w:eastAsia="Helvetica" w:hAnsi="Helvetica"/>
           <w:b/>
           <w:bCs/>
           <w:color w:val="1A1A1A"/>
@@ -2155,7 +2155,7 @@
       </w:pPr>
       <w:r>
         <w:rPr>
-          <w:rFonts w:ascii="Georgia" w:cs="Georgia" w:eastAsia="Georgia" w:hAnsi="Georgia"/>
+          <w:rFonts w:ascii="Helvetica" w:cs="Helvetica" w:eastAsia="Helvetica" w:hAnsi="Helvetica"/>
           <w:color w:val="1A1A1A"/>
           <w:sz w:val="20"/>
           <w:szCs w:val="20"/>
@@ -2169,7 +2169,7 @@
       </w:pPr>
       <w:r>
         <w:rPr>
-          <w:rFonts w:ascii="Georgia" w:cs="Georgia" w:eastAsia="Georgia" w:hAnsi="Georgia"/>
+          <w:rFonts w:ascii="Helvetica" w:cs="Helvetica" w:eastAsia="Helvetica" w:hAnsi="Helvetica"/>
           <w:b/>
           <w:bCs/>
           <w:color w:val="1A1A1A"/>
@@ -2180,7 +2180,7 @@
       </w:r>
       <w:r>
         <w:rPr>
-          <w:rFonts w:ascii="Georgia" w:cs="Georgia" w:eastAsia="Georgia" w:hAnsi="Georgia"/>
+          <w:rFonts w:ascii="Helvetica" w:cs="Helvetica" w:eastAsia="Helvetica" w:hAnsi="Helvetica"/>
           <w:color w:val="1A1A1A"/>
           <w:sz w:val="20"/>
           <w:szCs w:val="20"/>
@@ -2197,7 +2197,7 @@
       </w:pPr>
       <w:r>
         <w:rPr>
-          <w:rFonts w:ascii="Georgia" w:cs="Georgia" w:eastAsia="Georgia" w:hAnsi="Georgia"/>
+          <w:rFonts w:ascii="Helvetica" w:cs="Helvetica" w:eastAsia="Helvetica" w:hAnsi="Helvetica"/>
           <w:b/>
           <w:bCs/>
           <w:color w:val="444444"/>
@@ -2208,7 +2208,7 @@
       </w:r>
       <w:r>
         <w:rPr>
-          <w:rFonts w:ascii="Georgia" w:cs="Georgia" w:eastAsia="Georgia" w:hAnsi="Georgia"/>
+          <w:rFonts w:ascii="Helvetica" w:cs="Helvetica" w:eastAsia="Helvetica" w:hAnsi="Helvetica"/>
           <w:color w:val="444444"/>
           <w:sz w:val="20"/>
           <w:szCs w:val="20"/>
@@ -2223,7 +2223,7 @@
       </w:pPr>
       <w:r>
         <w:rPr>
-          <w:rFonts w:ascii="Avenir Next" w:cs="Avenir Next" w:eastAsia="Avenir Next" w:hAnsi="Avenir Next"/>
+          <w:rFonts w:ascii="Helvetica" w:cs="Helvetica" w:eastAsia="Helvetica" w:hAnsi="Helvetica"/>
           <w:b/>
           <w:bCs/>
           <w:color w:val="1A1A1A"/>
@@ -2240,7 +2240,7 @@
       </w:pPr>
       <w:r>
         <w:rPr>
-          <w:rFonts w:ascii="Georgia" w:cs="Georgia" w:eastAsia="Georgia" w:hAnsi="Georgia"/>
+          <w:rFonts w:ascii="Helvetica" w:cs="Helvetica" w:eastAsia="Helvetica" w:hAnsi="Helvetica"/>
           <w:color w:val="1A1A1A"/>
           <w:sz w:val="20"/>
           <w:szCs w:val="20"/>
@@ -2254,7 +2254,7 @@
       </w:pPr>
       <w:r>
         <w:rPr>
-          <w:rFonts w:ascii="Georgia" w:cs="Georgia" w:eastAsia="Georgia" w:hAnsi="Georgia"/>
+          <w:rFonts w:ascii="Helvetica" w:cs="Helvetica" w:eastAsia="Helvetica" w:hAnsi="Helvetica"/>
           <w:b/>
           <w:bCs/>
           <w:color w:val="1A1A1A"/>
@@ -2265,7 +2265,7 @@
       </w:r>
       <w:r>
         <w:rPr>
-          <w:rFonts w:ascii="Georgia" w:cs="Georgia" w:eastAsia="Georgia" w:hAnsi="Georgia"/>
+          <w:rFonts w:ascii="Helvetica" w:cs="Helvetica" w:eastAsia="Helvetica" w:hAnsi="Helvetica"/>
           <w:color w:val="1A1A1A"/>
           <w:sz w:val="20"/>
           <w:szCs w:val="20"/>
@@ -2282,7 +2282,7 @@
       </w:pPr>
       <w:r>
         <w:rPr>
-          <w:rFonts w:ascii="Georgia" w:cs="Georgia" w:eastAsia="Georgia" w:hAnsi="Georgia"/>
+          <w:rFonts w:ascii="Helvetica" w:cs="Helvetica" w:eastAsia="Helvetica" w:hAnsi="Helvetica"/>
           <w:b/>
           <w:bCs/>
           <w:color w:val="444444"/>
@@ -2293,7 +2293,7 @@
       </w:r>
       <w:r>
         <w:rPr>
-          <w:rFonts w:ascii="Georgia" w:cs="Georgia" w:eastAsia="Georgia" w:hAnsi="Georgia"/>
+          <w:rFonts w:ascii="Helvetica" w:cs="Helvetica" w:eastAsia="Helvetica" w:hAnsi="Helvetica"/>
           <w:color w:val="444444"/>
           <w:sz w:val="20"/>
           <w:szCs w:val="20"/>
@@ -2308,7 +2308,7 @@
       </w:pPr>
       <w:r>
         <w:rPr>
-          <w:rFonts w:ascii="Avenir Next" w:cs="Avenir Next" w:eastAsia="Avenir Next" w:hAnsi="Avenir Next"/>
+          <w:rFonts w:ascii="Helvetica" w:cs="Helvetica" w:eastAsia="Helvetica" w:hAnsi="Helvetica"/>
           <w:b/>
           <w:bCs/>
           <w:color w:val="1A1A1A"/>
@@ -2325,7 +2325,7 @@
       </w:pPr>
       <w:r>
         <w:rPr>
-          <w:rFonts w:ascii="Georgia" w:cs="Georgia" w:eastAsia="Georgia" w:hAnsi="Georgia"/>
+          <w:rFonts w:ascii="Helvetica" w:cs="Helvetica" w:eastAsia="Helvetica" w:hAnsi="Helvetica"/>
           <w:color w:val="1A1A1A"/>
           <w:sz w:val="20"/>
           <w:szCs w:val="20"/>
@@ -2343,7 +2343,7 @@
       </w:r>
       <w:r>
         <w:rPr>
-          <w:rFonts w:ascii="Georgia" w:cs="Georgia" w:eastAsia="Georgia" w:hAnsi="Georgia"/>
+          <w:rFonts w:ascii="Helvetica" w:cs="Helvetica" w:eastAsia="Helvetica" w:hAnsi="Helvetica"/>
           <w:color w:val="1A1A1A"/>
           <w:sz w:val="20"/>
           <w:szCs w:val="20"/>
@@ -2357,7 +2357,7 @@
       </w:pPr>
       <w:r>
         <w:rPr>
-          <w:rFonts w:ascii="Georgia" w:cs="Georgia" w:eastAsia="Georgia" w:hAnsi="Georgia"/>
+          <w:rFonts w:ascii="Helvetica" w:cs="Helvetica" w:eastAsia="Helvetica" w:hAnsi="Helvetica"/>
           <w:b/>
           <w:bCs/>
           <w:color w:val="1A1A1A"/>
@@ -2368,7 +2368,7 @@
       </w:r>
       <w:r>
         <w:rPr>
-          <w:rFonts w:ascii="Georgia" w:cs="Georgia" w:eastAsia="Georgia" w:hAnsi="Georgia"/>
+          <w:rFonts w:ascii="Helvetica" w:cs="Helvetica" w:eastAsia="Helvetica" w:hAnsi="Helvetica"/>
           <w:color w:val="1A1A1A"/>
           <w:sz w:val="20"/>
           <w:szCs w:val="20"/>
@@ -2385,7 +2385,7 @@
       </w:pPr>
       <w:r>
         <w:rPr>
-          <w:rFonts w:ascii="Georgia" w:cs="Georgia" w:eastAsia="Georgia" w:hAnsi="Georgia"/>
+          <w:rFonts w:ascii="Helvetica" w:cs="Helvetica" w:eastAsia="Helvetica" w:hAnsi="Helvetica"/>
           <w:b/>
           <w:bCs/>
           <w:color w:val="444444"/>
@@ -2396,7 +2396,7 @@
       </w:r>
       <w:r>
         <w:rPr>
-          <w:rFonts w:ascii="Georgia" w:cs="Georgia" w:eastAsia="Georgia" w:hAnsi="Georgia"/>
+          <w:rFonts w:ascii="Helvetica" w:cs="Helvetica" w:eastAsia="Helvetica" w:hAnsi="Helvetica"/>
           <w:color w:val="444444"/>
           <w:sz w:val="20"/>
           <w:szCs w:val="20"/>
@@ -2411,7 +2411,7 @@
       </w:pPr>
       <w:r>
         <w:rPr>
-          <w:rFonts w:ascii="Avenir Next" w:cs="Avenir Next" w:eastAsia="Avenir Next" w:hAnsi="Avenir Next"/>
+          <w:rFonts w:ascii="Helvetica" w:cs="Helvetica" w:eastAsia="Helvetica" w:hAnsi="Helvetica"/>
           <w:b/>
           <w:bCs/>
           <w:color w:val="1A1A1A"/>
@@ -2437,7 +2437,7 @@
       </w:r>
       <w:r>
         <w:rPr>
-          <w:rFonts w:ascii="Georgia" w:cs="Georgia" w:eastAsia="Georgia" w:hAnsi="Georgia"/>
+          <w:rFonts w:ascii="Helvetica" w:cs="Helvetica" w:eastAsia="Helvetica" w:hAnsi="Helvetica"/>
           <w:color w:val="1A1A1A"/>
           <w:sz w:val="20"/>
           <w:szCs w:val="20"/>
@@ -2461,7 +2461,7 @@
       </w:r>
       <w:r>
         <w:rPr>
-          <w:rFonts w:ascii="Georgia" w:cs="Georgia" w:eastAsia="Georgia" w:hAnsi="Georgia"/>
+          <w:rFonts w:ascii="Helvetica" w:cs="Helvetica" w:eastAsia="Helvetica" w:hAnsi="Helvetica"/>
           <w:color w:val="1A1A1A"/>
           <w:sz w:val="20"/>
           <w:szCs w:val="20"/>
@@ -2479,7 +2479,7 @@
       </w:r>
       <w:r>
         <w:rPr>
-          <w:rFonts w:ascii="Georgia" w:cs="Georgia" w:eastAsia="Georgia" w:hAnsi="Georgia"/>
+          <w:rFonts w:ascii="Helvetica" w:cs="Helvetica" w:eastAsia="Helvetica" w:hAnsi="Helvetica"/>
           <w:color w:val="1A1A1A"/>
           <w:sz w:val="20"/>
           <w:szCs w:val="20"/>
@@ -2493,7 +2493,7 @@
       </w:pPr>
       <w:r>
         <w:rPr>
-          <w:rFonts w:ascii="Georgia" w:cs="Georgia" w:eastAsia="Georgia" w:hAnsi="Georgia"/>
+          <w:rFonts w:ascii="Helvetica" w:cs="Helvetica" w:eastAsia="Helvetica" w:hAnsi="Helvetica"/>
           <w:b/>
           <w:bCs/>
           <w:color w:val="1A1A1A"/>
@@ -2504,7 +2504,7 @@
       </w:r>
       <w:r>
         <w:rPr>
-          <w:rFonts w:ascii="Georgia" w:cs="Georgia" w:eastAsia="Georgia" w:hAnsi="Georgia"/>
+          <w:rFonts w:ascii="Helvetica" w:cs="Helvetica" w:eastAsia="Helvetica" w:hAnsi="Helvetica"/>
           <w:color w:val="1A1A1A"/>
           <w:sz w:val="20"/>
           <w:szCs w:val="20"/>
@@ -2521,7 +2521,7 @@
       </w:pPr>
       <w:r>
         <w:rPr>
-          <w:rFonts w:ascii="Georgia" w:cs="Georgia" w:eastAsia="Georgia" w:hAnsi="Georgia"/>
+          <w:rFonts w:ascii="Helvetica" w:cs="Helvetica" w:eastAsia="Helvetica" w:hAnsi="Helvetica"/>
           <w:b/>
           <w:bCs/>
           <w:color w:val="444444"/>
@@ -2532,7 +2532,7 @@
       </w:r>
       <w:r>
         <w:rPr>
-          <w:rFonts w:ascii="Georgia" w:cs="Georgia" w:eastAsia="Georgia" w:hAnsi="Georgia"/>
+          <w:rFonts w:ascii="Helvetica" w:cs="Helvetica" w:eastAsia="Helvetica" w:hAnsi="Helvetica"/>
           <w:color w:val="444444"/>
           <w:sz w:val="20"/>
           <w:szCs w:val="20"/>
@@ -2547,7 +2547,7 @@
       </w:pPr>
       <w:r>
         <w:rPr>
-          <w:rFonts w:ascii="Avenir Next" w:cs="Avenir Next" w:eastAsia="Avenir Next" w:hAnsi="Avenir Next"/>
+          <w:rFonts w:ascii="Helvetica" w:cs="Helvetica" w:eastAsia="Helvetica" w:hAnsi="Helvetica"/>
           <w:b/>
           <w:bCs/>
           <w:color w:val="1A1A1A"/>
@@ -2564,7 +2564,7 @@
       </w:pPr>
       <w:r>
         <w:rPr>
-          <w:rFonts w:ascii="Georgia" w:cs="Georgia" w:eastAsia="Georgia" w:hAnsi="Georgia"/>
+          <w:rFonts w:ascii="Helvetica" w:cs="Helvetica" w:eastAsia="Helvetica" w:hAnsi="Helvetica"/>
           <w:color w:val="1A1A1A"/>
           <w:sz w:val="20"/>
           <w:szCs w:val="20"/>
@@ -2578,7 +2578,7 @@
       </w:pPr>
       <w:r>
         <w:rPr>
-          <w:rFonts w:ascii="Georgia" w:cs="Georgia" w:eastAsia="Georgia" w:hAnsi="Georgia"/>
+          <w:rFonts w:ascii="Helvetica" w:cs="Helvetica" w:eastAsia="Helvetica" w:hAnsi="Helvetica"/>
           <w:b/>
           <w:bCs/>
           <w:color w:val="1A1A1A"/>
@@ -2589,7 +2589,7 @@
       </w:r>
       <w:r>
         <w:rPr>
-          <w:rFonts w:ascii="Georgia" w:cs="Georgia" w:eastAsia="Georgia" w:hAnsi="Georgia"/>
+          <w:rFonts w:ascii="Helvetica" w:cs="Helvetica" w:eastAsia="Helvetica" w:hAnsi="Helvetica"/>
           <w:color w:val="1A1A1A"/>
           <w:sz w:val="20"/>
           <w:szCs w:val="20"/>
@@ -2606,7 +2606,7 @@
       </w:pPr>
       <w:r>
         <w:rPr>
-          <w:rFonts w:ascii="Georgia" w:cs="Georgia" w:eastAsia="Georgia" w:hAnsi="Georgia"/>
+          <w:rFonts w:ascii="Helvetica" w:cs="Helvetica" w:eastAsia="Helvetica" w:hAnsi="Helvetica"/>
           <w:b/>
           <w:bCs/>
           <w:color w:val="444444"/>
@@ -2617,7 +2617,7 @@
       </w:r>
       <w:r>
         <w:rPr>
-          <w:rFonts w:ascii="Georgia" w:cs="Georgia" w:eastAsia="Georgia" w:hAnsi="Georgia"/>
+          <w:rFonts w:ascii="Helvetica" w:cs="Helvetica" w:eastAsia="Helvetica" w:hAnsi="Helvetica"/>
           <w:color w:val="444444"/>
           <w:sz w:val="20"/>
           <w:szCs w:val="20"/>
@@ -2632,7 +2632,7 @@
       </w:pPr>
       <w:r>
         <w:rPr>
-          <w:rFonts w:ascii="Avenir Next" w:cs="Avenir Next" w:eastAsia="Avenir Next" w:hAnsi="Avenir Next"/>
+          <w:rFonts w:ascii="Helvetica" w:cs="Helvetica" w:eastAsia="Helvetica" w:hAnsi="Helvetica"/>
           <w:b/>
           <w:bCs/>
           <w:color w:val="1A1A1A"/>
@@ -2649,7 +2649,7 @@
       </w:pPr>
       <w:r>
         <w:rPr>
-          <w:rFonts w:ascii="Georgia" w:cs="Georgia" w:eastAsia="Georgia" w:hAnsi="Georgia"/>
+          <w:rFonts w:ascii="Helvetica" w:cs="Helvetica" w:eastAsia="Helvetica" w:hAnsi="Helvetica"/>
           <w:color w:val="1A1A1A"/>
           <w:sz w:val="20"/>
           <w:szCs w:val="20"/>
@@ -2663,7 +2663,7 @@
       </w:pPr>
       <w:r>
         <w:rPr>
-          <w:rFonts w:ascii="Georgia" w:cs="Georgia" w:eastAsia="Georgia" w:hAnsi="Georgia"/>
+          <w:rFonts w:ascii="Helvetica" w:cs="Helvetica" w:eastAsia="Helvetica" w:hAnsi="Helvetica"/>
           <w:b/>
           <w:bCs/>
           <w:color w:val="1A1A1A"/>
@@ -2674,7 +2674,7 @@
       </w:r>
       <w:r>
         <w:rPr>
-          <w:rFonts w:ascii="Georgia" w:cs="Georgia" w:eastAsia="Georgia" w:hAnsi="Georgia"/>
+          <w:rFonts w:ascii="Helvetica" w:cs="Helvetica" w:eastAsia="Helvetica" w:hAnsi="Helvetica"/>
           <w:color w:val="1A1A1A"/>
           <w:sz w:val="20"/>
           <w:szCs w:val="20"/>
@@ -2691,7 +2691,7 @@
       </w:pPr>
       <w:r>
         <w:rPr>
-          <w:rFonts w:ascii="Georgia" w:cs="Georgia" w:eastAsia="Georgia" w:hAnsi="Georgia"/>
+          <w:rFonts w:ascii="Helvetica" w:cs="Helvetica" w:eastAsia="Helvetica" w:hAnsi="Helvetica"/>
           <w:b/>
           <w:bCs/>
           <w:color w:val="444444"/>
@@ -2702,7 +2702,7 @@
       </w:r>
       <w:r>
         <w:rPr>
-          <w:rFonts w:ascii="Georgia" w:cs="Georgia" w:eastAsia="Georgia" w:hAnsi="Georgia"/>
+          <w:rFonts w:ascii="Helvetica" w:cs="Helvetica" w:eastAsia="Helvetica" w:hAnsi="Helvetica"/>
           <w:color w:val="444444"/>
           <w:sz w:val="20"/>
           <w:szCs w:val="20"/>
@@ -2726,7 +2726,7 @@
       </w:pPr>
       <w:r>
         <w:rPr>
-          <w:rFonts w:ascii="Avenir Next" w:cs="Avenir Next" w:eastAsia="Avenir Next" w:hAnsi="Avenir Next"/>
+          <w:rFonts w:ascii="Helvetica" w:cs="Helvetica" w:eastAsia="Helvetica" w:hAnsi="Helvetica"/>
           <w:b/>
           <w:bCs/>
           <w:color w:val="1A1A1A"/>
@@ -2752,7 +2752,7 @@
       </w:r>
       <w:r>
         <w:rPr>
-          <w:rFonts w:ascii="Georgia" w:cs="Georgia" w:eastAsia="Georgia" w:hAnsi="Georgia"/>
+          <w:rFonts w:ascii="Helvetica" w:cs="Helvetica" w:eastAsia="Helvetica" w:hAnsi="Helvetica"/>
           <w:color w:val="1A1A1A"/>
           <w:sz w:val="20"/>
           <w:szCs w:val="20"/>
@@ -2770,7 +2770,7 @@
       </w:r>
       <w:r>
         <w:rPr>
-          <w:rFonts w:ascii="Georgia" w:cs="Georgia" w:eastAsia="Georgia" w:hAnsi="Georgia"/>
+          <w:rFonts w:ascii="Helvetica" w:cs="Helvetica" w:eastAsia="Helvetica" w:hAnsi="Helvetica"/>
           <w:color w:val="1A1A1A"/>
           <w:sz w:val="20"/>
           <w:szCs w:val="20"/>
@@ -2788,7 +2788,7 @@
       </w:r>
       <w:r>
         <w:rPr>
-          <w:rFonts w:ascii="Georgia" w:cs="Georgia" w:eastAsia="Georgia" w:hAnsi="Georgia"/>
+          <w:rFonts w:ascii="Helvetica" w:cs="Helvetica" w:eastAsia="Helvetica" w:hAnsi="Helvetica"/>
           <w:color w:val="1A1A1A"/>
           <w:sz w:val="20"/>
           <w:szCs w:val="20"/>
@@ -2806,7 +2806,7 @@
       </w:r>
       <w:r>
         <w:rPr>
-          <w:rFonts w:ascii="Georgia" w:cs="Georgia" w:eastAsia="Georgia" w:hAnsi="Georgia"/>
+          <w:rFonts w:ascii="Helvetica" w:cs="Helvetica" w:eastAsia="Helvetica" w:hAnsi="Helvetica"/>
           <w:color w:val="1A1A1A"/>
           <w:sz w:val="20"/>
           <w:szCs w:val="20"/>
@@ -2824,7 +2824,7 @@
       </w:r>
       <w:r>
         <w:rPr>
-          <w:rFonts w:ascii="Georgia" w:cs="Georgia" w:eastAsia="Georgia" w:hAnsi="Georgia"/>
+          <w:rFonts w:ascii="Helvetica" w:cs="Helvetica" w:eastAsia="Helvetica" w:hAnsi="Helvetica"/>
           <w:color w:val="1A1A1A"/>
           <w:sz w:val="20"/>
           <w:szCs w:val="20"/>
@@ -2839,7 +2839,7 @@
       </w:pPr>
       <w:r>
         <w:rPr>
-          <w:rFonts w:ascii="Georgia" w:cs="Georgia" w:eastAsia="Georgia" w:hAnsi="Georgia"/>
+          <w:rFonts w:ascii="Helvetica" w:cs="Helvetica" w:eastAsia="Helvetica" w:hAnsi="Helvetica"/>
           <w:color w:val="1A1A1A"/>
           <w:sz w:val="20"/>
           <w:szCs w:val="20"/>
@@ -2853,7 +2853,7 @@
       </w:pPr>
       <w:r>
         <w:rPr>
-          <w:rFonts w:ascii="Georgia" w:cs="Georgia" w:eastAsia="Georgia" w:hAnsi="Georgia"/>
+          <w:rFonts w:ascii="Helvetica" w:cs="Helvetica" w:eastAsia="Helvetica" w:hAnsi="Helvetica"/>
           <w:b/>
           <w:bCs/>
           <w:color w:val="1A1A1A"/>
@@ -2864,7 +2864,7 @@
       </w:r>
       <w:r>
         <w:rPr>
-          <w:rFonts w:ascii="Georgia" w:cs="Georgia" w:eastAsia="Georgia" w:hAnsi="Georgia"/>
+          <w:rFonts w:ascii="Helvetica" w:cs="Helvetica" w:eastAsia="Helvetica" w:hAnsi="Helvetica"/>
           <w:color w:val="1A1A1A"/>
           <w:sz w:val="20"/>
           <w:szCs w:val="20"/>
@@ -2881,7 +2881,7 @@
       </w:pPr>
       <w:r>
         <w:rPr>
-          <w:rFonts w:ascii="Georgia" w:cs="Georgia" w:eastAsia="Georgia" w:hAnsi="Georgia"/>
+          <w:rFonts w:ascii="Helvetica" w:cs="Helvetica" w:eastAsia="Helvetica" w:hAnsi="Helvetica"/>
           <w:b/>
           <w:bCs/>
           <w:color w:val="444444"/>
@@ -2892,7 +2892,7 @@
       </w:r>
       <w:r>
         <w:rPr>
-          <w:rFonts w:ascii="Georgia" w:cs="Georgia" w:eastAsia="Georgia" w:hAnsi="Georgia"/>
+          <w:rFonts w:ascii="Helvetica" w:cs="Helvetica" w:eastAsia="Helvetica" w:hAnsi="Helvetica"/>
           <w:color w:val="444444"/>
           <w:sz w:val="20"/>
           <w:szCs w:val="20"/>
@@ -2907,7 +2907,7 @@
       </w:pPr>
       <w:r>
         <w:rPr>
-          <w:rFonts w:ascii="Avenir Next" w:cs="Avenir Next" w:eastAsia="Avenir Next" w:hAnsi="Avenir Next"/>
+          <w:rFonts w:ascii="Helvetica" w:cs="Helvetica" w:eastAsia="Helvetica" w:hAnsi="Helvetica"/>
           <w:b/>
           <w:bCs/>
           <w:color w:val="1A1A1A"/>
@@ -2924,7 +2924,7 @@
       </w:pPr>
       <w:r>
         <w:rPr>
-          <w:rFonts w:ascii="Georgia" w:cs="Georgia" w:eastAsia="Georgia" w:hAnsi="Georgia"/>
+          <w:rFonts w:ascii="Helvetica" w:cs="Helvetica" w:eastAsia="Helvetica" w:hAnsi="Helvetica"/>
           <w:color w:val="1A1A1A"/>
           <w:sz w:val="20"/>
           <w:szCs w:val="20"/>
@@ -2938,7 +2938,7 @@
       </w:pPr>
       <w:r>
         <w:rPr>
-          <w:rFonts w:ascii="Georgia" w:cs="Georgia" w:eastAsia="Georgia" w:hAnsi="Georgia"/>
+          <w:rFonts w:ascii="Helvetica" w:cs="Helvetica" w:eastAsia="Helvetica" w:hAnsi="Helvetica"/>
           <w:b/>
           <w:bCs/>
           <w:color w:val="1A1A1A"/>
@@ -2949,7 +2949,7 @@
       </w:r>
       <w:r>
         <w:rPr>
-          <w:rFonts w:ascii="Georgia" w:cs="Georgia" w:eastAsia="Georgia" w:hAnsi="Georgia"/>
+          <w:rFonts w:ascii="Helvetica" w:cs="Helvetica" w:eastAsia="Helvetica" w:hAnsi="Helvetica"/>
           <w:color w:val="1A1A1A"/>
           <w:sz w:val="20"/>
           <w:szCs w:val="20"/>
@@ -2966,7 +2966,7 @@
       </w:pPr>
       <w:r>
         <w:rPr>
-          <w:rFonts w:ascii="Georgia" w:cs="Georgia" w:eastAsia="Georgia" w:hAnsi="Georgia"/>
+          <w:rFonts w:ascii="Helvetica" w:cs="Helvetica" w:eastAsia="Helvetica" w:hAnsi="Helvetica"/>
           <w:b/>
           <w:bCs/>
           <w:color w:val="444444"/>
@@ -2977,7 +2977,7 @@
       </w:r>
       <w:r>
         <w:rPr>
-          <w:rFonts w:ascii="Georgia" w:cs="Georgia" w:eastAsia="Georgia" w:hAnsi="Georgia"/>
+          <w:rFonts w:ascii="Helvetica" w:cs="Helvetica" w:eastAsia="Helvetica" w:hAnsi="Helvetica"/>
           <w:color w:val="444444"/>
           <w:sz w:val="20"/>
           <w:szCs w:val="20"/>
@@ -3000,7 +3000,7 @@
       </w:pPr>
       <w:r>
         <w:rPr>
-          <w:rFonts w:ascii="Georgia" w:cs="Georgia" w:eastAsia="Georgia" w:hAnsi="Georgia"/>
+          <w:rFonts w:ascii="Helvetica" w:cs="Helvetica" w:eastAsia="Helvetica" w:hAnsi="Helvetica"/>
           <w:color w:val="1A1A1A"/>
           <w:sz w:val="20"/>
           <w:szCs w:val="20"/>
@@ -3019,7 +3019,7 @@
       </w:pPr>
       <w:r>
         <w:rPr>
-          <w:rFonts w:ascii="Georgia" w:cs="Georgia" w:eastAsia="Georgia" w:hAnsi="Georgia"/>
+          <w:rFonts w:ascii="Helvetica" w:cs="Helvetica" w:eastAsia="Helvetica" w:hAnsi="Helvetica"/>
           <w:b/>
           <w:bCs/>
           <w:color w:val="1A1A1A"/>
@@ -3030,7 +3030,7 @@
       </w:r>
       <w:r>
         <w:rPr>
-          <w:rFonts w:ascii="Georgia" w:cs="Georgia" w:eastAsia="Georgia" w:hAnsi="Georgia"/>
+          <w:rFonts w:ascii="Helvetica" w:cs="Helvetica" w:eastAsia="Helvetica" w:hAnsi="Helvetica"/>
           <w:color w:val="1A1A1A"/>
           <w:sz w:val="20"/>
           <w:szCs w:val="20"/>
@@ -3049,7 +3049,7 @@
       </w:pPr>
       <w:r>
         <w:rPr>
-          <w:rFonts w:ascii="Georgia" w:cs="Georgia" w:eastAsia="Georgia" w:hAnsi="Georgia"/>
+          <w:rFonts w:ascii="Helvetica" w:cs="Helvetica" w:eastAsia="Helvetica" w:hAnsi="Helvetica"/>
           <w:b/>
           <w:bCs/>
           <w:color w:val="1A1A1A"/>
@@ -3060,7 +3060,7 @@
       </w:r>
       <w:r>
         <w:rPr>
-          <w:rFonts w:ascii="Georgia" w:cs="Georgia" w:eastAsia="Georgia" w:hAnsi="Georgia"/>
+          <w:rFonts w:ascii="Helvetica" w:cs="Helvetica" w:eastAsia="Helvetica" w:hAnsi="Helvetica"/>
           <w:color w:val="1A1A1A"/>
           <w:sz w:val="20"/>
           <w:szCs w:val="20"/>
@@ -3126,7 +3126,7 @@
             </w:pPr>
             <w:r>
               <w:rPr>
-                <w:rFonts w:ascii="Avenir Next" w:cs="Avenir Next" w:eastAsia="Avenir Next" w:hAnsi="Avenir Next"/>
+                <w:rFonts w:ascii="Helvetica" w:cs="Helvetica" w:eastAsia="Helvetica" w:hAnsi="Helvetica"/>
                 <w:b/>
                 <w:bCs/>
                 <w:color w:val="333333"/>
@@ -3159,7 +3159,7 @@
             </w:pPr>
             <w:r>
               <w:rPr>
-                <w:rFonts w:ascii="Avenir Next" w:cs="Avenir Next" w:eastAsia="Avenir Next" w:hAnsi="Avenir Next"/>
+                <w:rFonts w:ascii="Helvetica" w:cs="Helvetica" w:eastAsia="Helvetica" w:hAnsi="Helvetica"/>
                 <w:b/>
                 <w:bCs/>
                 <w:color w:val="333333"/>
@@ -3192,7 +3192,7 @@
             </w:pPr>
             <w:r>
               <w:rPr>
-                <w:rFonts w:ascii="Avenir Next" w:cs="Avenir Next" w:eastAsia="Avenir Next" w:hAnsi="Avenir Next"/>
+                <w:rFonts w:ascii="Helvetica" w:cs="Helvetica" w:eastAsia="Helvetica" w:hAnsi="Helvetica"/>
                 <w:b/>
                 <w:bCs/>
                 <w:color w:val="333333"/>
@@ -3230,7 +3230,7 @@
             </w:pPr>
             <w:r>
               <w:rPr>
-                <w:rFonts w:ascii="Avenir Next" w:cs="Avenir Next" w:eastAsia="Avenir Next" w:hAnsi="Avenir Next"/>
+                <w:rFonts w:ascii="Helvetica" w:cs="Helvetica" w:eastAsia="Helvetica" w:hAnsi="Helvetica"/>
                 <w:color w:val="1A1A1A"/>
                 <w:sz w:val="16"/>
                 <w:szCs w:val="16"/>
@@ -3261,7 +3261,7 @@
             </w:pPr>
             <w:r>
               <w:rPr>
-                <w:rFonts w:ascii="Avenir Next" w:cs="Avenir Next" w:eastAsia="Avenir Next" w:hAnsi="Avenir Next"/>
+                <w:rFonts w:ascii="Helvetica" w:cs="Helvetica" w:eastAsia="Helvetica" w:hAnsi="Helvetica"/>
                 <w:color w:val="1A1A1A"/>
                 <w:sz w:val="16"/>
                 <w:szCs w:val="16"/>
@@ -3292,7 +3292,7 @@
             </w:pPr>
             <w:r>
               <w:rPr>
-                <w:rFonts w:ascii="Avenir Next" w:cs="Avenir Next" w:eastAsia="Avenir Next" w:hAnsi="Avenir Next"/>
+                <w:rFonts w:ascii="Helvetica" w:cs="Helvetica" w:eastAsia="Helvetica" w:hAnsi="Helvetica"/>
                 <w:color w:val="1A1A1A"/>
                 <w:sz w:val="16"/>
                 <w:szCs w:val="16"/>
@@ -3328,7 +3328,7 @@
             </w:pPr>
             <w:r>
               <w:rPr>
-                <w:rFonts w:ascii="Avenir Next" w:cs="Avenir Next" w:eastAsia="Avenir Next" w:hAnsi="Avenir Next"/>
+                <w:rFonts w:ascii="Helvetica" w:cs="Helvetica" w:eastAsia="Helvetica" w:hAnsi="Helvetica"/>
                 <w:color w:val="1A1A1A"/>
                 <w:sz w:val="16"/>
                 <w:szCs w:val="16"/>
@@ -3359,7 +3359,7 @@
             </w:pPr>
             <w:r>
               <w:rPr>
-                <w:rFonts w:ascii="Avenir Next" w:cs="Avenir Next" w:eastAsia="Avenir Next" w:hAnsi="Avenir Next"/>
+                <w:rFonts w:ascii="Helvetica" w:cs="Helvetica" w:eastAsia="Helvetica" w:hAnsi="Helvetica"/>
                 <w:color w:val="1A1A1A"/>
                 <w:sz w:val="16"/>
                 <w:szCs w:val="16"/>
@@ -3390,7 +3390,7 @@
             </w:pPr>
             <w:r>
               <w:rPr>
-                <w:rFonts w:ascii="Avenir Next" w:cs="Avenir Next" w:eastAsia="Avenir Next" w:hAnsi="Avenir Next"/>
+                <w:rFonts w:ascii="Helvetica" w:cs="Helvetica" w:eastAsia="Helvetica" w:hAnsi="Helvetica"/>
                 <w:color w:val="1A1A1A"/>
                 <w:sz w:val="16"/>
                 <w:szCs w:val="16"/>
@@ -3426,7 +3426,7 @@
             </w:pPr>
             <w:r>
               <w:rPr>
-                <w:rFonts w:ascii="Avenir Next" w:cs="Avenir Next" w:eastAsia="Avenir Next" w:hAnsi="Avenir Next"/>
+                <w:rFonts w:ascii="Helvetica" w:cs="Helvetica" w:eastAsia="Helvetica" w:hAnsi="Helvetica"/>
                 <w:color w:val="1A1A1A"/>
                 <w:sz w:val="16"/>
                 <w:szCs w:val="16"/>
@@ -3457,7 +3457,7 @@
             </w:pPr>
             <w:r>
               <w:rPr>
-                <w:rFonts w:ascii="Avenir Next" w:cs="Avenir Next" w:eastAsia="Avenir Next" w:hAnsi="Avenir Next"/>
+                <w:rFonts w:ascii="Helvetica" w:cs="Helvetica" w:eastAsia="Helvetica" w:hAnsi="Helvetica"/>
                 <w:color w:val="1A1A1A"/>
                 <w:sz w:val="16"/>
                 <w:szCs w:val="16"/>
@@ -3488,7 +3488,7 @@
             </w:pPr>
             <w:r>
               <w:rPr>
-                <w:rFonts w:ascii="Avenir Next" w:cs="Avenir Next" w:eastAsia="Avenir Next" w:hAnsi="Avenir Next"/>
+                <w:rFonts w:ascii="Helvetica" w:cs="Helvetica" w:eastAsia="Helvetica" w:hAnsi="Helvetica"/>
                 <w:color w:val="1A1A1A"/>
                 <w:sz w:val="16"/>
                 <w:szCs w:val="16"/>
@@ -3524,7 +3524,7 @@
             </w:pPr>
             <w:r>
               <w:rPr>
-                <w:rFonts w:ascii="Avenir Next" w:cs="Avenir Next" w:eastAsia="Avenir Next" w:hAnsi="Avenir Next"/>
+                <w:rFonts w:ascii="Helvetica" w:cs="Helvetica" w:eastAsia="Helvetica" w:hAnsi="Helvetica"/>
                 <w:color w:val="1A1A1A"/>
                 <w:sz w:val="16"/>
                 <w:szCs w:val="16"/>
@@ -3555,7 +3555,7 @@
             </w:pPr>
             <w:r>
               <w:rPr>
-                <w:rFonts w:ascii="Avenir Next" w:cs="Avenir Next" w:eastAsia="Avenir Next" w:hAnsi="Avenir Next"/>
+                <w:rFonts w:ascii="Helvetica" w:cs="Helvetica" w:eastAsia="Helvetica" w:hAnsi="Helvetica"/>
                 <w:color w:val="1A1A1A"/>
                 <w:sz w:val="16"/>
                 <w:szCs w:val="16"/>
@@ -3586,7 +3586,7 @@
             </w:pPr>
             <w:r>
               <w:rPr>
-                <w:rFonts w:ascii="Avenir Next" w:cs="Avenir Next" w:eastAsia="Avenir Next" w:hAnsi="Avenir Next"/>
+                <w:rFonts w:ascii="Helvetica" w:cs="Helvetica" w:eastAsia="Helvetica" w:hAnsi="Helvetica"/>
                 <w:color w:val="1A1A1A"/>
                 <w:sz w:val="16"/>
                 <w:szCs w:val="16"/>
@@ -3622,7 +3622,7 @@
             </w:pPr>
             <w:r>
               <w:rPr>
-                <w:rFonts w:ascii="Avenir Next" w:cs="Avenir Next" w:eastAsia="Avenir Next" w:hAnsi="Avenir Next"/>
+                <w:rFonts w:ascii="Helvetica" w:cs="Helvetica" w:eastAsia="Helvetica" w:hAnsi="Helvetica"/>
                 <w:color w:val="1A1A1A"/>
                 <w:sz w:val="16"/>
                 <w:szCs w:val="16"/>
@@ -3653,7 +3653,7 @@
             </w:pPr>
             <w:r>
               <w:rPr>
-                <w:rFonts w:ascii="Avenir Next" w:cs="Avenir Next" w:eastAsia="Avenir Next" w:hAnsi="Avenir Next"/>
+                <w:rFonts w:ascii="Helvetica" w:cs="Helvetica" w:eastAsia="Helvetica" w:hAnsi="Helvetica"/>
                 <w:color w:val="1A1A1A"/>
                 <w:sz w:val="16"/>
                 <w:szCs w:val="16"/>
@@ -3684,7 +3684,7 @@
             </w:pPr>
             <w:r>
               <w:rPr>
-                <w:rFonts w:ascii="Avenir Next" w:cs="Avenir Next" w:eastAsia="Avenir Next" w:hAnsi="Avenir Next"/>
+                <w:rFonts w:ascii="Helvetica" w:cs="Helvetica" w:eastAsia="Helvetica" w:hAnsi="Helvetica"/>
                 <w:color w:val="1A1A1A"/>
                 <w:sz w:val="16"/>
                 <w:szCs w:val="16"/>
@@ -3720,7 +3720,7 @@
       </w:pPr>
       <w:r>
         <w:rPr>
-          <w:rFonts w:ascii="Georgia" w:cs="Georgia" w:eastAsia="Georgia" w:hAnsi="Georgia"/>
+          <w:rFonts w:ascii="Helvetica" w:cs="Helvetica" w:eastAsia="Helvetica" w:hAnsi="Helvetica"/>
           <w:b/>
           <w:bCs/>
           <w:color w:val="1A1A1A"/>
@@ -3731,7 +3731,7 @@
       </w:r>
       <w:r>
         <w:rPr>
-          <w:rFonts w:ascii="Georgia" w:cs="Georgia" w:eastAsia="Georgia" w:hAnsi="Georgia"/>
+          <w:rFonts w:ascii="Helvetica" w:cs="Helvetica" w:eastAsia="Helvetica" w:hAnsi="Helvetica"/>
           <w:color w:val="1A1A1A"/>
           <w:sz w:val="20"/>
           <w:szCs w:val="20"/>
@@ -3750,7 +3750,7 @@
       </w:pPr>
       <w:r>
         <w:rPr>
-          <w:rFonts w:ascii="Georgia" w:cs="Georgia" w:eastAsia="Georgia" w:hAnsi="Georgia"/>
+          <w:rFonts w:ascii="Helvetica" w:cs="Helvetica" w:eastAsia="Helvetica" w:hAnsi="Helvetica"/>
           <w:b/>
           <w:bCs/>
           <w:color w:val="1A1A1A"/>
@@ -3761,7 +3761,7 @@
       </w:r>
       <w:r>
         <w:rPr>
-          <w:rFonts w:ascii="Georgia" w:cs="Georgia" w:eastAsia="Georgia" w:hAnsi="Georgia"/>
+          <w:rFonts w:ascii="Helvetica" w:cs="Helvetica" w:eastAsia="Helvetica" w:hAnsi="Helvetica"/>
           <w:color w:val="1A1A1A"/>
           <w:sz w:val="20"/>
           <w:szCs w:val="20"/>
@@ -3780,7 +3780,7 @@
       </w:pPr>
       <w:r>
         <w:rPr>
-          <w:rFonts w:ascii="Georgia" w:cs="Georgia" w:eastAsia="Georgia" w:hAnsi="Georgia"/>
+          <w:rFonts w:ascii="Helvetica" w:cs="Helvetica" w:eastAsia="Helvetica" w:hAnsi="Helvetica"/>
           <w:b/>
           <w:bCs/>
           <w:color w:val="1A1A1A"/>
@@ -3791,7 +3791,7 @@
       </w:r>
       <w:r>
         <w:rPr>
-          <w:rFonts w:ascii="Georgia" w:cs="Georgia" w:eastAsia="Georgia" w:hAnsi="Georgia"/>
+          <w:rFonts w:ascii="Helvetica" w:cs="Helvetica" w:eastAsia="Helvetica" w:hAnsi="Helvetica"/>
           <w:color w:val="1A1A1A"/>
           <w:sz w:val="20"/>
           <w:szCs w:val="20"/>
@@ -3810,7 +3810,7 @@
       </w:pPr>
       <w:r>
         <w:rPr>
-          <w:rFonts w:ascii="Georgia" w:cs="Georgia" w:eastAsia="Georgia" w:hAnsi="Georgia"/>
+          <w:rFonts w:ascii="Helvetica" w:cs="Helvetica" w:eastAsia="Helvetica" w:hAnsi="Helvetica"/>
           <w:b/>
           <w:bCs/>
           <w:color w:val="1A1A1A"/>
@@ -3821,7 +3821,7 @@
       </w:r>
       <w:r>
         <w:rPr>
-          <w:rFonts w:ascii="Georgia" w:cs="Georgia" w:eastAsia="Georgia" w:hAnsi="Georgia"/>
+          <w:rFonts w:ascii="Helvetica" w:cs="Helvetica" w:eastAsia="Helvetica" w:hAnsi="Helvetica"/>
           <w:color w:val="1A1A1A"/>
           <w:sz w:val="20"/>
           <w:szCs w:val="20"/>
@@ -3840,7 +3840,7 @@
       </w:pPr>
       <w:r>
         <w:rPr>
-          <w:rFonts w:ascii="Georgia" w:cs="Georgia" w:eastAsia="Georgia" w:hAnsi="Georgia"/>
+          <w:rFonts w:ascii="Helvetica" w:cs="Helvetica" w:eastAsia="Helvetica" w:hAnsi="Helvetica"/>
           <w:b/>
           <w:bCs/>
           <w:color w:val="1A1A1A"/>
@@ -3851,12 +3851,12 @@
       </w:r>
       <w:r>
         <w:rPr>
-          <w:rFonts w:ascii="Georgia" w:cs="Georgia" w:eastAsia="Georgia" w:hAnsi="Georgia"/>
-          <w:color w:val="1A1A1A"/>
-          <w:sz w:val="20"/>
-          <w:szCs w:val="20"/>
-        </w:rPr>
-        <w:t xml:space="preserve"> und keine Zahl, die nicht in der Belegt-Liste des Leitfadens steht.</w:t>
+          <w:rFonts w:ascii="Helvetica" w:cs="Helvetica" w:eastAsia="Helvetica" w:hAnsi="Helvetica"/>
+          <w:color w:val="1A1A1A"/>
+          <w:sz w:val="20"/>
+          <w:szCs w:val="20"/>
+        </w:rPr>
+        <w:t xml:space="preserve"> und keine Zahl, die nicht in der Belegt-Liste des Leitfadens steht. Rechenbeispiele wie „15 € je Text“ nur als Beispiel formuliert.</w:t>
       </w:r>
     </w:p>
     <w:sectPr>
@@ -3921,7 +3921,7 @@
     </w:pPr>
     <w:r>
       <w:rPr>
-        <w:rFonts w:ascii="Avenir Next" w:cs="Avenir Next" w:eastAsia="Avenir Next" w:hAnsi="Avenir Next"/>
+        <w:rFonts w:ascii="Helvetica" w:cs="Helvetica" w:eastAsia="Helvetica" w:hAnsi="Helvetica"/>
         <w:color w:val="6B6B6B"/>
         <w:sz w:val="15"/>
         <w:szCs w:val="15"/>
@@ -4096,7 +4096,7 @@
   <w:docDefaults>
     <w:rPrDefault>
       <w:rPr>
-        <w:rFonts w:ascii="Georgia" w:cs="Georgia" w:eastAsia="Georgia" w:hAnsi="Georgia"/>
+        <w:rFonts w:ascii="Helvetica" w:cs="Helvetica" w:eastAsia="Helvetica" w:hAnsi="Helvetica"/>
         <w:color w:val="1A1A1A"/>
         <w:sz w:val="20"/>
         <w:szCs w:val="20"/>
@@ -4285,7 +4285,7 @@
       <w:outlineLvl w:val="0"/>
     </w:pPr>
     <w:rPr>
-      <w:rFonts w:ascii="Avenir Next" w:cs="Avenir Next" w:eastAsia="Avenir Next" w:hAnsi="Avenir Next"/>
+      <w:rFonts w:ascii="Helvetica" w:cs="Helvetica" w:eastAsia="Helvetica" w:hAnsi="Helvetica"/>
       <w:b/>
       <w:bCs/>
       <w:color w:val="1A1A1A"/>
@@ -4303,7 +4303,7 @@
       <w:outlineLvl w:val="1"/>
     </w:pPr>
     <w:rPr>
-      <w:rFonts w:ascii="Avenir Next" w:cs="Avenir Next" w:eastAsia="Avenir Next" w:hAnsi="Avenir Next"/>
+      <w:rFonts w:ascii="Helvetica" w:cs="Helvetica" w:eastAsia="Helvetica" w:hAnsi="Helvetica"/>
       <w:b/>
       <w:bCs/>
       <w:color w:val="1A1A1A"/>
@@ -4318,7 +4318,7 @@
       <w:spacing w:after="20" w:before="100"/>
     </w:pPr>
     <w:rPr>
-      <w:rFonts w:ascii="Avenir Next" w:cs="Avenir Next" w:eastAsia="Avenir Next" w:hAnsi="Avenir Next"/>
+      <w:rFonts w:ascii="Helvetica" w:cs="Helvetica" w:eastAsia="Helvetica" w:hAnsi="Helvetica"/>
       <w:b/>
       <w:bCs/>
       <w:sz w:val="18"/>
@@ -4333,7 +4333,7 @@
       <w:ind w:left="360"/>
     </w:pPr>
     <w:rPr>
-      <w:rFonts w:ascii="Avenir Next" w:cs="Avenir Next" w:eastAsia="Avenir Next" w:hAnsi="Avenir Next"/>
+      <w:rFonts w:ascii="Helvetica" w:cs="Helvetica" w:eastAsia="Helvetica" w:hAnsi="Helvetica"/>
       <w:sz w:val="17"/>
       <w:szCs w:val="17"/>
     </w:rPr>

</xml_diff>